<commit_message>
chore(content): atualizar formação acadêmica nos CVs para UniCesumar
</commit_message>
<xml_diff>
--- a/public/CVs/CV-Andre-Ximenes-desenvolvedor-backend.docx
+++ b/public/CVs/CV-Andre-Ximenes-desenvolvedor-backend.docx
@@ -1126,7 +1126,7 @@
           <w:szCs w:val="21"/>
           <w:rtl w:val="0"/>
         </w:rPr>
-        <w:t xml:space="preserve">Universidade Estadual do Vale do Acaraú</w:t>
+        <w:t xml:space="preserve">UniCesumar</w:t>
       </w:r>
       <w:r>
         <w:rPr>
@@ -1146,7 +1146,7 @@
           <w:szCs w:val="21"/>
           <w:rtl w:val="0"/>
         </w:rPr>
-        <w:t xml:space="preserve">Ciência da Computação</w:t>
+        <w:t xml:space="preserve">Análise e Desenvolvimento de Sistemas</w:t>
       </w:r>
       <w:r>
         <w:rPr>
@@ -1168,7 +1168,7 @@
           <w:szCs w:val="18"/>
           <w:rtl w:val="0"/>
         </w:rPr>
-        <w:t xml:space="preserve">Em andamento</w:t>
+        <w:t xml:space="preserve">2026 — Presente</w:t>
       </w:r>
       <w:r>
         <w:rPr>

</xml_diff>